<commit_message>
Add Menu and Roll a Six for Stage 2
Added Menu class to display games and return the player's choice,
and RollASix game with score, while loop and win/lose result.
GameController now creates both and runs the selected game.

Updated design: CRC cards and class diagram now include a
displayHeader method for each game, plus Menu and RollASix.
</commit_message>
<xml_diff>
--- a/DiceGame/docs/Dice Game Part 2 design.docx
+++ b/DiceGame/docs/Dice Game Part 2 design.docx
@@ -179,16 +179,8 @@
         <w:rPr>
           <w:color w:val="000000" w:themeColor="text1"/>
         </w:rPr>
-        <w:t xml:space="preserve">more </w:t>
-      </w:r>
-      <w:proofErr w:type="gramStart"/>
-      <w:r>
-        <w:rPr>
-          <w:color w:val="000000" w:themeColor="text1"/>
-        </w:rPr>
-        <w:t>incisive</w:t>
-      </w:r>
-      <w:proofErr w:type="gramEnd"/>
+        <w:t>more incisive</w:t>
+      </w:r>
     </w:p>
     <w:p>
       <w:r>
@@ -300,6 +292,9 @@
     </w:p>
     <w:p>
       <w:r>
+        <w:rPr>
+          <w:noProof/>
+        </w:rPr>
         <w:drawing>
           <wp:inline distT="0" distB="0" distL="0" distR="0" wp14:anchorId="3C9AE900" wp14:editId="1DE978B3">
             <wp:extent cx="5227773" cy="3810330"/>
@@ -347,21 +342,7 @@
         <w:rPr>
           <w:color w:val="EE0000"/>
         </w:rPr>
-        <w:t xml:space="preserve">Had include display menu but </w:t>
-      </w:r>
-      <w:proofErr w:type="gramStart"/>
-      <w:r>
-        <w:rPr>
-          <w:color w:val="EE0000"/>
-        </w:rPr>
-        <w:t>was removed</w:t>
-      </w:r>
-      <w:proofErr w:type="gramEnd"/>
-      <w:r>
-        <w:rPr>
-          <w:color w:val="EE0000"/>
-        </w:rPr>
-        <w:t xml:space="preserve"> because it </w:t>
+        <w:t xml:space="preserve">Had include display menu but was removed because it </w:t>
       </w:r>
       <w:proofErr w:type="gramStart"/>
       <w:r>
@@ -375,16 +356,8 @@
         <w:rPr>
           <w:color w:val="EE0000"/>
         </w:rPr>
-        <w:t xml:space="preserve"> nothing different as a use </w:t>
-      </w:r>
-      <w:proofErr w:type="gramStart"/>
-      <w:r>
-        <w:rPr>
-          <w:color w:val="EE0000"/>
-        </w:rPr>
-        <w:t>case</w:t>
-      </w:r>
-      <w:proofErr w:type="gramEnd"/>
+        <w:t xml:space="preserve"> nothing different as a use case</w:t>
+      </w:r>
     </w:p>
     <w:p>
       <w:r>
@@ -431,13 +404,8 @@
         <w:pStyle w:val="Heading2"/>
       </w:pPr>
       <w:r>
-        <w:t xml:space="preserve">Use Case </w:t>
-      </w:r>
-      <w:proofErr w:type="gramStart"/>
-      <w:r>
-        <w:t>description</w:t>
-      </w:r>
-      <w:proofErr w:type="gramEnd"/>
+        <w:t>Use Case description</w:t>
+      </w:r>
     </w:p>
     <w:p>
       <w:pPr>
@@ -949,75 +917,64 @@
           </w:tcPr>
           <w:p>
             <w:r>
-              <w:t xml:space="preserve">Repeats </w:t>
+              <w:t>System: Display header</w:t>
+            </w:r>
+          </w:p>
+          <w:p>
+            <w:r>
+              <w:t>Repeats 20 time {</w:t>
+            </w:r>
+            <w:r>
+              <w:t xml:space="preserve">System: </w:t>
+            </w:r>
+            <w:r>
+              <w:t xml:space="preserve">rolls dice </w:t>
+            </w:r>
+          </w:p>
+          <w:p>
+            <w:r>
+              <w:t xml:space="preserve">System: </w:t>
+            </w:r>
+            <w:r>
+              <w:t xml:space="preserve">displays result of roll}  </w:t>
+            </w:r>
+            <w:r>
+              <w:br/>
             </w:r>
             <w:proofErr w:type="gramStart"/>
             <w:r>
-              <w:t>20</w:t>
+              <w:t>System:</w:t>
             </w:r>
             <w:proofErr w:type="gramEnd"/>
             <w:r>
-              <w:t xml:space="preserve"> time {</w:t>
-            </w:r>
-            <w:r>
-              <w:t xml:space="preserve">System: </w:t>
-            </w:r>
-            <w:r>
-              <w:t xml:space="preserve">rolls </w:t>
-            </w:r>
+              <w:t xml:space="preserve"> </w:t>
+            </w:r>
+            <w:r>
+              <w:t xml:space="preserve">displays </w:t>
+            </w:r>
+            <w:proofErr w:type="spellStart"/>
+            <w:r>
+              <w:t>userName</w:t>
+            </w:r>
+            <w:proofErr w:type="spellEnd"/>
+            <w:r>
+              <w:t xml:space="preserve"> and thank you for playing message</w:t>
+            </w:r>
+          </w:p>
+        </w:tc>
+      </w:tr>
+      <w:tr>
+        <w:tc>
+          <w:tcPr>
+            <w:tcW w:w="4508" w:type="dxa"/>
+          </w:tcPr>
+          <w:p>
             <w:proofErr w:type="gramStart"/>
             <w:r>
-              <w:t>dice</w:t>
+              <w:t>extends(</w:t>
             </w:r>
             <w:proofErr w:type="gramEnd"/>
             <w:r>
-              <w:t xml:space="preserve"> </w:t>
-            </w:r>
-          </w:p>
-          <w:p>
-            <w:r>
-              <w:t xml:space="preserve">System: </w:t>
-            </w:r>
-            <w:r>
-              <w:t xml:space="preserve">displays result of roll}  </w:t>
-            </w:r>
-            <w:r>
-              <w:br/>
-            </w:r>
-            <w:proofErr w:type="gramStart"/>
-            <w:r>
-              <w:t>System:</w:t>
-            </w:r>
-            <w:proofErr w:type="gramEnd"/>
-            <w:r>
-              <w:t xml:space="preserve"> </w:t>
-            </w:r>
-            <w:r>
-              <w:t xml:space="preserve">displays </w:t>
-            </w:r>
-            <w:proofErr w:type="spellStart"/>
-            <w:r>
-              <w:t>userName</w:t>
-            </w:r>
-            <w:proofErr w:type="spellEnd"/>
-            <w:r>
-              <w:t xml:space="preserve"> and thank you for playing message</w:t>
-            </w:r>
-          </w:p>
-        </w:tc>
-      </w:tr>
-      <w:tr>
-        <w:tc>
-          <w:tcPr>
-            <w:tcW w:w="4508" w:type="dxa"/>
-          </w:tcPr>
-          <w:p>
-            <w:proofErr w:type="gramStart"/>
-            <w:r>
-              <w:t>extends(</w:t>
-            </w:r>
-            <w:proofErr w:type="gramEnd"/>
-            <w:r>
               <w:t>alternative flow)</w:t>
             </w:r>
           </w:p>
@@ -1048,7 +1005,19 @@
         </w:tc>
       </w:tr>
     </w:tbl>
-    <w:p/>
+    <w:p>
+      <w:r>
+        <w:t>*</w:t>
+      </w:r>
+      <w:proofErr w:type="gramStart"/>
+      <w:r>
+        <w:t>added</w:t>
+      </w:r>
+      <w:proofErr w:type="gramEnd"/>
+      <w:r>
+        <w:t xml:space="preserve"> display header stage 2 </w:t>
+      </w:r>
+    </w:p>
     <w:p>
       <w:pPr>
         <w:pStyle w:val="Heading2"/>
@@ -1227,10 +1196,7 @@
           </w:tcPr>
           <w:p>
             <w:r>
-              <w:t>System:</w:t>
-            </w:r>
-            <w:r>
-              <w:t xml:space="preserve"> </w:t>
+              <w:t xml:space="preserve">System: </w:t>
             </w:r>
             <w:r>
               <w:t>game selected</w:t>
@@ -1345,6 +1311,7 @@
     <w:p/>
     <w:p>
       <w:r>
+        <w:lastRenderedPageBreak/>
         <w:br/>
       </w:r>
     </w:p>
@@ -1353,7 +1320,6 @@
         <w:pStyle w:val="Heading2"/>
       </w:pPr>
       <w:r>
-        <w:lastRenderedPageBreak/>
         <w:t xml:space="preserve">Play </w:t>
       </w:r>
       <w:r>
@@ -1498,10 +1464,7 @@
               <w:t xml:space="preserve"> select</w:t>
             </w:r>
             <w:r>
-              <w:t xml:space="preserve">s </w:t>
-            </w:r>
-            <w:r>
-              <w:t>roll a six</w:t>
+              <w:t>s roll a six</w:t>
             </w:r>
           </w:p>
         </w:tc>
@@ -1576,6 +1539,11 @@
           </w:tcPr>
           <w:p>
             <w:r>
+              <w:t>Display: Display header</w:t>
+            </w:r>
+          </w:p>
+          <w:p>
+            <w:r>
               <w:t>System: score set to 5</w:t>
             </w:r>
           </w:p>
@@ -1604,15 +1572,7 @@
               <w:t xml:space="preserve">System: </w:t>
             </w:r>
             <w:r>
-              <w:t xml:space="preserve">if result is </w:t>
-            </w:r>
-            <w:proofErr w:type="gramStart"/>
-            <w:r>
-              <w:t>6</w:t>
-            </w:r>
-            <w:proofErr w:type="gramEnd"/>
-            <w:r>
-              <w:t xml:space="preserve"> end game </w:t>
+              <w:t xml:space="preserve">if result is 6 end game </w:t>
             </w:r>
           </w:p>
           <w:p>
@@ -1707,6 +1667,218 @@
         <w:t>rs</w:t>
       </w:r>
     </w:p>
+    <w:p>
+      <w:r>
+        <w:t>Main</w:t>
+      </w:r>
+    </w:p>
+    <w:tbl>
+      <w:tblPr>
+        <w:tblStyle w:val="TableGrid"/>
+        <w:tblW w:w="0" w:type="auto"/>
+        <w:tblLook w:val="04A0" w:firstRow="1" w:lastRow="0" w:firstColumn="1" w:lastColumn="0" w:noHBand="0" w:noVBand="1"/>
+      </w:tblPr>
+      <w:tblGrid>
+        <w:gridCol w:w="4654"/>
+        <w:gridCol w:w="4362"/>
+      </w:tblGrid>
+      <w:tr>
+        <w:tc>
+          <w:tcPr>
+            <w:tcW w:w="4654" w:type="dxa"/>
+          </w:tcPr>
+          <w:p>
+            <w:pPr>
+              <w:jc w:val="center"/>
+            </w:pPr>
+            <w:r>
+              <w:t>Responsibilities</w:t>
+            </w:r>
+          </w:p>
+        </w:tc>
+        <w:tc>
+          <w:tcPr>
+            <w:tcW w:w="4362" w:type="dxa"/>
+          </w:tcPr>
+          <w:p>
+            <w:pPr>
+              <w:jc w:val="center"/>
+            </w:pPr>
+            <w:r>
+              <w:t>Collaborators</w:t>
+            </w:r>
+          </w:p>
+        </w:tc>
+      </w:tr>
+      <w:tr>
+        <w:tc>
+          <w:tcPr>
+            <w:tcW w:w="4654" w:type="dxa"/>
+          </w:tcPr>
+          <w:p>
+            <w:proofErr w:type="gramStart"/>
+            <w:r>
+              <w:t>Does :</w:t>
+            </w:r>
+            <w:proofErr w:type="gramEnd"/>
+            <w:r>
+              <w:rPr>
+                <w:color w:val="EE0000"/>
+              </w:rPr>
+              <w:t xml:space="preserve"> </w:t>
+            </w:r>
+          </w:p>
+        </w:tc>
+        <w:tc>
+          <w:tcPr>
+            <w:tcW w:w="4362" w:type="dxa"/>
+          </w:tcPr>
+          <w:p>
+            <w:proofErr w:type="spellStart"/>
+            <w:r>
+              <w:rPr>
+                <w:color w:val="EE0000"/>
+              </w:rPr>
+              <w:t>G</w:t>
+            </w:r>
+            <w:r>
+              <w:rPr>
+                <w:color w:val="EE0000"/>
+              </w:rPr>
+              <w:t>ameController</w:t>
+            </w:r>
+            <w:proofErr w:type="spellEnd"/>
+          </w:p>
+        </w:tc>
+      </w:tr>
+      <w:tr>
+        <w:tc>
+          <w:tcPr>
+            <w:tcW w:w="4654" w:type="dxa"/>
+          </w:tcPr>
+          <w:p>
+            <w:r>
+              <w:t>Creates:</w:t>
+            </w:r>
+            <w:r>
+              <w:rPr>
+                <w:color w:val="EE0000"/>
+              </w:rPr>
+              <w:t xml:space="preserve"> </w:t>
+            </w:r>
+            <w:proofErr w:type="spellStart"/>
+            <w:r>
+              <w:rPr>
+                <w:color w:val="EE0000"/>
+              </w:rPr>
+              <w:t>GameController</w:t>
+            </w:r>
+            <w:proofErr w:type="spellEnd"/>
+          </w:p>
+        </w:tc>
+        <w:tc>
+          <w:tcPr>
+            <w:tcW w:w="4362" w:type="dxa"/>
+          </w:tcPr>
+          <w:p>
+            <w:proofErr w:type="spellStart"/>
+            <w:r>
+              <w:rPr>
+                <w:color w:val="196B24" w:themeColor="accent3"/>
+              </w:rPr>
+              <w:t>playGames</w:t>
+            </w:r>
+            <w:r>
+              <w:t>.</w:t>
+            </w:r>
+            <w:r>
+              <w:rPr>
+                <w:color w:val="156082" w:themeColor="accent1"/>
+              </w:rPr>
+              <w:t>start</w:t>
+            </w:r>
+            <w:proofErr w:type="spellEnd"/>
+            <w:r>
+              <w:t>()</w:t>
+            </w:r>
+          </w:p>
+        </w:tc>
+      </w:tr>
+      <w:tr>
+        <w:tc>
+          <w:tcPr>
+            <w:tcW w:w="4654" w:type="dxa"/>
+          </w:tcPr>
+          <w:p>
+            <w:proofErr w:type="spellStart"/>
+            <w:proofErr w:type="gramStart"/>
+            <w:r>
+              <w:t>Calls:</w:t>
+            </w:r>
+            <w:r>
+              <w:rPr>
+                <w:color w:val="196B24" w:themeColor="accent3"/>
+              </w:rPr>
+              <w:t>playGame</w:t>
+            </w:r>
+            <w:r>
+              <w:rPr>
+                <w:color w:val="196B24" w:themeColor="accent3"/>
+              </w:rPr>
+              <w:t>s</w:t>
+            </w:r>
+            <w:r>
+              <w:t>.</w:t>
+            </w:r>
+            <w:r>
+              <w:rPr>
+                <w:color w:val="156082" w:themeColor="accent1"/>
+              </w:rPr>
+              <w:t>start</w:t>
+            </w:r>
+            <w:proofErr w:type="spellEnd"/>
+            <w:proofErr w:type="gramEnd"/>
+            <w:r>
+              <w:t>()</w:t>
+            </w:r>
+          </w:p>
+        </w:tc>
+        <w:tc>
+          <w:tcPr>
+            <w:tcW w:w="4362" w:type="dxa"/>
+          </w:tcPr>
+          <w:p>
+            <w:pPr>
+              <w:rPr>
+                <w:color w:val="EE0000"/>
+              </w:rPr>
+            </w:pPr>
+          </w:p>
+        </w:tc>
+      </w:tr>
+    </w:tbl>
+    <w:p>
+      <w:r>
+        <w:t>*Added at stage 2 was missing</w:t>
+      </w:r>
+    </w:p>
+    <w:p>
+      <w:pPr>
+        <w:pStyle w:val="Heading3"/>
+      </w:pPr>
+    </w:p>
+    <w:p/>
+    <w:p>
+      <w:pPr>
+        <w:pStyle w:val="Heading3"/>
+      </w:pPr>
+    </w:p>
+    <w:p/>
+    <w:p/>
+    <w:p/>
+    <w:p/>
+    <w:p/>
+    <w:p/>
     <w:p>
       <w:pPr>
         <w:pStyle w:val="Heading3"/>
@@ -1733,7 +1905,7 @@
       <w:tr>
         <w:tc>
           <w:tcPr>
-            <w:tcW w:w="4654" w:type="dxa"/>
+            <w:tcW w:w="4617" w:type="dxa"/>
           </w:tcPr>
           <w:p>
             <w:pPr>
@@ -1746,7 +1918,7 @@
         </w:tc>
         <w:tc>
           <w:tcPr>
-            <w:tcW w:w="4362" w:type="dxa"/>
+            <w:tcW w:w="4399" w:type="dxa"/>
           </w:tcPr>
           <w:p>
             <w:pPr>
@@ -1761,7 +1933,7 @@
       <w:tr>
         <w:tc>
           <w:tcPr>
-            <w:tcW w:w="4654" w:type="dxa"/>
+            <w:tcW w:w="4617" w:type="dxa"/>
           </w:tcPr>
           <w:p>
             <w:r>
@@ -1779,7 +1951,7 @@
         </w:tc>
         <w:tc>
           <w:tcPr>
-            <w:tcW w:w="4362" w:type="dxa"/>
+            <w:tcW w:w="4399" w:type="dxa"/>
           </w:tcPr>
           <w:p>
             <w:proofErr w:type="spellStart"/>
@@ -1796,7 +1968,7 @@
       <w:tr>
         <w:tc>
           <w:tcPr>
-            <w:tcW w:w="4654" w:type="dxa"/>
+            <w:tcW w:w="4617" w:type="dxa"/>
           </w:tcPr>
           <w:p>
             <w:r>
@@ -1826,7 +1998,7 @@
         </w:tc>
         <w:tc>
           <w:tcPr>
-            <w:tcW w:w="4362" w:type="dxa"/>
+            <w:tcW w:w="4399" w:type="dxa"/>
           </w:tcPr>
           <w:p>
             <w:proofErr w:type="spellStart"/>
@@ -1877,7 +2049,7 @@
       <w:tr>
         <w:tc>
           <w:tcPr>
-            <w:tcW w:w="4654" w:type="dxa"/>
+            <w:tcW w:w="4617" w:type="dxa"/>
           </w:tcPr>
           <w:p>
             <w:r>
@@ -1895,7 +2067,7 @@
         </w:tc>
         <w:tc>
           <w:tcPr>
-            <w:tcW w:w="4362" w:type="dxa"/>
+            <w:tcW w:w="4399" w:type="dxa"/>
           </w:tcPr>
           <w:p>
             <w:pPr>
@@ -1917,7 +2089,7 @@
       <w:tr>
         <w:tc>
           <w:tcPr>
-            <w:tcW w:w="4654" w:type="dxa"/>
+            <w:tcW w:w="4617" w:type="dxa"/>
           </w:tcPr>
           <w:p>
             <w:r>
@@ -1955,7 +2127,7 @@
         </w:tc>
         <w:tc>
           <w:tcPr>
-            <w:tcW w:w="4362" w:type="dxa"/>
+            <w:tcW w:w="4399" w:type="dxa"/>
           </w:tcPr>
           <w:p>
             <w:pPr>
@@ -2000,7 +2172,7 @@
       <w:tr>
         <w:tc>
           <w:tcPr>
-            <w:tcW w:w="4654" w:type="dxa"/>
+            <w:tcW w:w="4617" w:type="dxa"/>
           </w:tcPr>
           <w:p>
             <w:r>
@@ -2016,7 +2188,7 @@
         </w:tc>
         <w:tc>
           <w:tcPr>
-            <w:tcW w:w="4362" w:type="dxa"/>
+            <w:tcW w:w="4399" w:type="dxa"/>
           </w:tcPr>
           <w:p>
             <w:pPr>
@@ -2030,7 +2202,7 @@
       <w:tr>
         <w:tc>
           <w:tcPr>
-            <w:tcW w:w="4654" w:type="dxa"/>
+            <w:tcW w:w="4617" w:type="dxa"/>
           </w:tcPr>
           <w:p>
             <w:r>
@@ -2063,7 +2235,7 @@
         </w:tc>
         <w:tc>
           <w:tcPr>
-            <w:tcW w:w="4362" w:type="dxa"/>
+            <w:tcW w:w="4399" w:type="dxa"/>
           </w:tcPr>
           <w:p>
             <w:r>
@@ -2078,7 +2250,92 @@
       <w:tr>
         <w:tc>
           <w:tcPr>
-            <w:tcW w:w="4654" w:type="dxa"/>
+            <w:tcW w:w="4617" w:type="dxa"/>
+          </w:tcPr>
+          <w:p>
+            <w:pPr>
+              <w:tabs>
+                <w:tab w:val="left" w:pos="1080"/>
+              </w:tabs>
+            </w:pPr>
+            <w:proofErr w:type="gramStart"/>
+            <w:r>
+              <w:t xml:space="preserve">Holds  </w:t>
+            </w:r>
+            <w:proofErr w:type="spellStart"/>
+            <w:r>
+              <w:rPr>
+                <w:color w:val="196B24" w:themeColor="accent3"/>
+              </w:rPr>
+              <w:t>userInput</w:t>
+            </w:r>
+            <w:proofErr w:type="spellEnd"/>
+            <w:proofErr w:type="gramEnd"/>
+            <w:r>
+              <w:t xml:space="preserve">(instance of </w:t>
+            </w:r>
+            <w:r>
+              <w:rPr>
+                <w:color w:val="EE0000"/>
+              </w:rPr>
+              <w:t>Scanner</w:t>
+            </w:r>
+            <w:r>
+              <w:t>)</w:t>
+            </w:r>
+          </w:p>
+        </w:tc>
+        <w:tc>
+          <w:tcPr>
+            <w:tcW w:w="4399" w:type="dxa"/>
+          </w:tcPr>
+          <w:p>
+            <w:proofErr w:type="spellStart"/>
+            <w:proofErr w:type="gramStart"/>
+            <w:r>
+              <w:rPr>
+                <w:color w:val="196B24" w:themeColor="accent3"/>
+              </w:rPr>
+              <w:t>menu</w:t>
+            </w:r>
+            <w:r>
+              <w:t>.</w:t>
+            </w:r>
+            <w:r>
+              <w:rPr>
+                <w:color w:val="4C94D8" w:themeColor="text2" w:themeTint="80"/>
+              </w:rPr>
+              <w:t>start</w:t>
+            </w:r>
+            <w:r>
+              <w:rPr>
+                <w:color w:val="4C94D8" w:themeColor="text2" w:themeTint="80"/>
+              </w:rPr>
+              <w:t>Menu</w:t>
+            </w:r>
+            <w:proofErr w:type="spellEnd"/>
+            <w:proofErr w:type="gramEnd"/>
+            <w:r>
+              <w:t>(</w:t>
+            </w:r>
+            <w:proofErr w:type="spellStart"/>
+            <w:r>
+              <w:rPr>
+                <w:color w:val="196B24" w:themeColor="accent3"/>
+              </w:rPr>
+              <w:t>userInput</w:t>
+            </w:r>
+            <w:proofErr w:type="spellEnd"/>
+            <w:r>
+              <w:t>)</w:t>
+            </w:r>
+          </w:p>
+        </w:tc>
+      </w:tr>
+      <w:tr>
+        <w:tc>
+          <w:tcPr>
+            <w:tcW w:w="4617" w:type="dxa"/>
           </w:tcPr>
           <w:p>
             <w:r>
@@ -2096,76 +2353,129 @@
         </w:tc>
         <w:tc>
           <w:tcPr>
-            <w:tcW w:w="4362" w:type="dxa"/>
+            <w:tcW w:w="4399" w:type="dxa"/>
+          </w:tcPr>
+          <w:p/>
+        </w:tc>
+      </w:tr>
+      <w:tr>
+        <w:tc>
+          <w:tcPr>
+            <w:tcW w:w="4617" w:type="dxa"/>
+          </w:tcPr>
+          <w:p/>
+        </w:tc>
+        <w:tc>
+          <w:tcPr>
+            <w:tcW w:w="4399" w:type="dxa"/>
+          </w:tcPr>
+          <w:p/>
+        </w:tc>
+      </w:tr>
+      <w:tr>
+        <w:tc>
+          <w:tcPr>
+            <w:tcW w:w="4617" w:type="dxa"/>
           </w:tcPr>
           <w:p>
             <w:proofErr w:type="spellStart"/>
             <w:proofErr w:type="gramStart"/>
             <w:r>
-              <w:rPr>
-                <w:color w:val="196B24" w:themeColor="accent3"/>
-              </w:rPr>
-              <w:t>menu</w:t>
-            </w:r>
-            <w:r>
-              <w:t>.</w:t>
-            </w:r>
+              <w:t>Does:</w:t>
+            </w:r>
+            <w:r>
+              <w:rPr>
+                <w:color w:val="156082" w:themeColor="accent1"/>
+              </w:rPr>
+              <w:t>start</w:t>
+            </w:r>
+            <w:proofErr w:type="spellEnd"/>
+            <w:proofErr w:type="gramEnd"/>
+          </w:p>
+        </w:tc>
+        <w:tc>
+          <w:tcPr>
+            <w:tcW w:w="4399" w:type="dxa"/>
+          </w:tcPr>
+          <w:p/>
+        </w:tc>
+      </w:tr>
+      <w:tr>
+        <w:tc>
+          <w:tcPr>
+            <w:tcW w:w="4617" w:type="dxa"/>
+          </w:tcPr>
+          <w:p>
+            <w:r>
+              <w:t xml:space="preserve">Does: </w:t>
+            </w:r>
+            <w:proofErr w:type="spellStart"/>
             <w:r>
               <w:rPr>
                 <w:color w:val="4C94D8" w:themeColor="text2" w:themeTint="80"/>
               </w:rPr>
-              <w:t>start</w:t>
-            </w:r>
+              <w:t>displayWelcomeMessage</w:t>
+            </w:r>
+            <w:proofErr w:type="spellEnd"/>
+          </w:p>
+        </w:tc>
+        <w:tc>
+          <w:tcPr>
+            <w:tcW w:w="4399" w:type="dxa"/>
+          </w:tcPr>
+          <w:p/>
+        </w:tc>
+      </w:tr>
+      <w:tr>
+        <w:tc>
+          <w:tcPr>
+            <w:tcW w:w="4617" w:type="dxa"/>
+          </w:tcPr>
+          <w:p>
+            <w:r>
+              <w:t xml:space="preserve">Does: </w:t>
+            </w:r>
+            <w:proofErr w:type="spellStart"/>
             <w:r>
               <w:rPr>
                 <w:color w:val="4C94D8" w:themeColor="text2" w:themeTint="80"/>
               </w:rPr>
-              <w:t>Menu</w:t>
+              <w:t>getUserName</w:t>
+            </w:r>
+            <w:proofErr w:type="spellEnd"/>
+          </w:p>
+        </w:tc>
+        <w:tc>
+          <w:tcPr>
+            <w:tcW w:w="4399" w:type="dxa"/>
+          </w:tcPr>
+          <w:p/>
+        </w:tc>
+      </w:tr>
+      <w:tr>
+        <w:tc>
+          <w:tcPr>
+            <w:tcW w:w="4617" w:type="dxa"/>
+          </w:tcPr>
+          <w:p>
+            <w:proofErr w:type="spellStart"/>
+            <w:proofErr w:type="gramStart"/>
+            <w:r>
+              <w:t>Does:</w:t>
+            </w:r>
+            <w:r>
+              <w:rPr>
+                <w:color w:val="4C94D8" w:themeColor="text2" w:themeTint="80"/>
+              </w:rPr>
+              <w:t>startMenu</w:t>
             </w:r>
             <w:proofErr w:type="spellEnd"/>
             <w:proofErr w:type="gramEnd"/>
-            <w:r>
-              <w:t>()</w:t>
-            </w:r>
-          </w:p>
-        </w:tc>
-      </w:tr>
-      <w:tr>
-        <w:tc>
-          <w:tcPr>
-            <w:tcW w:w="4654" w:type="dxa"/>
-          </w:tcPr>
-          <w:p>
-            <w:proofErr w:type="gramStart"/>
-            <w:r>
-              <w:t xml:space="preserve">Holds  </w:t>
-            </w:r>
-            <w:proofErr w:type="spellStart"/>
-            <w:r>
-              <w:rPr>
-                <w:color w:val="196B24" w:themeColor="accent3"/>
-              </w:rPr>
-              <w:t>userInput</w:t>
-            </w:r>
-            <w:proofErr w:type="spellEnd"/>
-            <w:proofErr w:type="gramEnd"/>
-            <w:r>
-              <w:t xml:space="preserve">(instance of </w:t>
-            </w:r>
-            <w:r>
-              <w:rPr>
-                <w:color w:val="EE0000"/>
-              </w:rPr>
-              <w:t>Scanner</w:t>
-            </w:r>
-            <w:r>
-              <w:t>)</w:t>
-            </w:r>
-          </w:p>
-        </w:tc>
-        <w:tc>
-          <w:tcPr>
-            <w:tcW w:w="4362" w:type="dxa"/>
+          </w:p>
+        </w:tc>
+        <w:tc>
+          <w:tcPr>
+            <w:tcW w:w="4399" w:type="dxa"/>
           </w:tcPr>
           <w:p/>
         </w:tc>
@@ -2173,134 +2483,43 @@
       <w:tr>
         <w:tc>
           <w:tcPr>
-            <w:tcW w:w="4654" w:type="dxa"/>
-          </w:tcPr>
-          <w:p/>
-        </w:tc>
-        <w:tc>
-          <w:tcPr>
-            <w:tcW w:w="4362" w:type="dxa"/>
-          </w:tcPr>
-          <w:p/>
-        </w:tc>
-      </w:tr>
-      <w:tr>
-        <w:tc>
-          <w:tcPr>
-            <w:tcW w:w="4654" w:type="dxa"/>
-          </w:tcPr>
-          <w:p>
-            <w:r>
-              <w:t xml:space="preserve">Does: </w:t>
+            <w:tcW w:w="4617" w:type="dxa"/>
+          </w:tcPr>
+          <w:p>
+            <w:r>
+              <w:t xml:space="preserve">Does:  </w:t>
             </w:r>
             <w:proofErr w:type="spellStart"/>
             <w:r>
               <w:rPr>
                 <w:color w:val="4C94D8" w:themeColor="text2" w:themeTint="80"/>
               </w:rPr>
-              <w:t>displayWelcomeMessage</w:t>
-            </w:r>
-            <w:proofErr w:type="spellEnd"/>
-          </w:p>
-        </w:tc>
-        <w:tc>
-          <w:tcPr>
-            <w:tcW w:w="4362" w:type="dxa"/>
-          </w:tcPr>
-          <w:p/>
-        </w:tc>
-      </w:tr>
-      <w:tr>
-        <w:tc>
-          <w:tcPr>
-            <w:tcW w:w="4654" w:type="dxa"/>
-          </w:tcPr>
-          <w:p>
-            <w:r>
-              <w:t xml:space="preserve">Does: </w:t>
-            </w:r>
-            <w:proofErr w:type="spellStart"/>
+              <w:t>playS</w:t>
+            </w:r>
             <w:r>
               <w:rPr>
                 <w:color w:val="4C94D8" w:themeColor="text2" w:themeTint="80"/>
               </w:rPr>
-              <w:t>getUserName</w:t>
-            </w:r>
-            <w:proofErr w:type="spellEnd"/>
-          </w:p>
-        </w:tc>
-        <w:tc>
-          <w:tcPr>
-            <w:tcW w:w="4362" w:type="dxa"/>
-          </w:tcPr>
-          <w:p/>
-        </w:tc>
-      </w:tr>
-      <w:tr>
-        <w:tc>
-          <w:tcPr>
-            <w:tcW w:w="4654" w:type="dxa"/>
-          </w:tcPr>
-          <w:p>
-            <w:proofErr w:type="spellStart"/>
-            <w:proofErr w:type="gramStart"/>
-            <w:r>
-              <w:t>Does:</w:t>
+              <w:t>elect</w:t>
             </w:r>
             <w:r>
               <w:rPr>
                 <w:color w:val="4C94D8" w:themeColor="text2" w:themeTint="80"/>
               </w:rPr>
-              <w:t>start</w:t>
+              <w:t>ed</w:t>
             </w:r>
             <w:r>
               <w:rPr>
                 <w:color w:val="4C94D8" w:themeColor="text2" w:themeTint="80"/>
               </w:rPr>
-              <w:t>Menu</w:t>
-            </w:r>
-            <w:proofErr w:type="spellEnd"/>
-            <w:proofErr w:type="gramEnd"/>
-          </w:p>
-        </w:tc>
-        <w:tc>
-          <w:tcPr>
-            <w:tcW w:w="4362" w:type="dxa"/>
-          </w:tcPr>
-          <w:p/>
-        </w:tc>
-      </w:tr>
-      <w:tr>
-        <w:tc>
-          <w:tcPr>
-            <w:tcW w:w="4654" w:type="dxa"/>
-          </w:tcPr>
-          <w:p>
-            <w:r>
-              <w:t xml:space="preserve">Does: </w:t>
-            </w:r>
-            <w:r>
-              <w:t xml:space="preserve"> </w:t>
-            </w:r>
-            <w:proofErr w:type="spellStart"/>
+              <w:t>Game</w:t>
+            </w:r>
+            <w:proofErr w:type="spellEnd"/>
             <w:r>
               <w:rPr>
                 <w:color w:val="4C94D8" w:themeColor="text2" w:themeTint="80"/>
               </w:rPr>
-              <w:t>selectGame</w:t>
-            </w:r>
-            <w:proofErr w:type="spellEnd"/>
-            <w:r>
-              <w:rPr>
-                <w:color w:val="4C94D8" w:themeColor="text2" w:themeTint="80"/>
-              </w:rPr>
-              <w:t xml:space="preserve"> </w:t>
-            </w:r>
-            <w:r>
-              <w:rPr>
-                <w:color w:val="4C94D8" w:themeColor="text2" w:themeTint="80"/>
-              </w:rPr>
-              <w:t xml:space="preserve"> </w:t>
+              <w:t xml:space="preserve">  </w:t>
             </w:r>
           </w:p>
           <w:p>
@@ -2337,7 +2556,6 @@
               <w:t xml:space="preserve"> passing </w:t>
             </w:r>
             <w:proofErr w:type="spellStart"/>
-            <w:proofErr w:type="gramStart"/>
             <w:r>
               <w:rPr>
                 <w:color w:val="196B24" w:themeColor="accent3"/>
@@ -2345,7 +2563,6 @@
               <w:t>uiserName</w:t>
             </w:r>
             <w:proofErr w:type="spellEnd"/>
-            <w:proofErr w:type="gramEnd"/>
           </w:p>
           <w:p>
             <w:pPr>
@@ -2384,7 +2601,33 @@
         </w:tc>
         <w:tc>
           <w:tcPr>
-            <w:tcW w:w="4362" w:type="dxa"/>
+            <w:tcW w:w="4399" w:type="dxa"/>
+          </w:tcPr>
+          <w:p/>
+        </w:tc>
+      </w:tr>
+      <w:tr>
+        <w:tc>
+          <w:tcPr>
+            <w:tcW w:w="4617" w:type="dxa"/>
+          </w:tcPr>
+          <w:p>
+            <w:r>
+              <w:t xml:space="preserve">Does </w:t>
+            </w:r>
+            <w:proofErr w:type="spellStart"/>
+            <w:r>
+              <w:rPr>
+                <w:color w:val="156082" w:themeColor="accent1"/>
+              </w:rPr>
+              <w:t>toString</w:t>
+            </w:r>
+            <w:proofErr w:type="spellEnd"/>
+          </w:p>
+        </w:tc>
+        <w:tc>
+          <w:tcPr>
+            <w:tcW w:w="4399" w:type="dxa"/>
           </w:tcPr>
           <w:p/>
         </w:tc>
@@ -2415,13 +2658,37 @@
         <w:t>crc</w:t>
       </w:r>
       <w:proofErr w:type="spellEnd"/>
+      <w:r>
+        <w:br/>
+        <w:t xml:space="preserve">*amend </w:t>
+      </w:r>
+      <w:proofErr w:type="spellStart"/>
+      <w:r>
+        <w:t>slectGame</w:t>
+      </w:r>
+      <w:proofErr w:type="spellEnd"/>
+      <w:r>
+        <w:t xml:space="preserve"> change to </w:t>
+      </w:r>
+      <w:proofErr w:type="spellStart"/>
+      <w:proofErr w:type="gramStart"/>
+      <w:r>
+        <w:t>playSelectedGame</w:t>
+      </w:r>
+      <w:proofErr w:type="spellEnd"/>
+      <w:r>
+        <w:t>(</w:t>
+      </w:r>
+      <w:proofErr w:type="gramEnd"/>
+      <w:r>
+        <w:t>more descriptive)</w:t>
+      </w:r>
     </w:p>
     <w:p>
       <w:pPr>
         <w:pStyle w:val="Heading3"/>
       </w:pPr>
       <w:r>
-        <w:lastRenderedPageBreak/>
         <w:t>Menu</w:t>
       </w:r>
     </w:p>
@@ -2507,14 +2774,41 @@
             <w:tcW w:w="4362" w:type="dxa"/>
           </w:tcPr>
           <w:p>
-            <w:proofErr w:type="spellStart"/>
-            <w:r>
+            <w:pPr>
               <w:rPr>
                 <w:color w:val="EE0000"/>
               </w:rPr>
+            </w:pPr>
+            <w:proofErr w:type="spellStart"/>
+            <w:r>
+              <w:rPr>
+                <w:color w:val="EE0000"/>
+              </w:rPr>
               <w:t>GameController</w:t>
             </w:r>
             <w:proofErr w:type="spellEnd"/>
+          </w:p>
+          <w:p>
+            <w:proofErr w:type="spellStart"/>
+            <w:r>
+              <w:rPr>
+                <w:color w:val="196B24" w:themeColor="accent3"/>
+              </w:rPr>
+              <w:t>userInput</w:t>
+            </w:r>
+            <w:r>
+              <w:t>.</w:t>
+            </w:r>
+            <w:r>
+              <w:rPr>
+                <w:color w:val="156082" w:themeColor="accent1"/>
+              </w:rPr>
+              <w:t>nextInt</w:t>
+            </w:r>
+            <w:proofErr w:type="spellEnd"/>
+            <w:r>
+              <w:t>()</w:t>
+            </w:r>
           </w:p>
         </w:tc>
       </w:tr>
@@ -2647,12 +2941,16 @@
       </w:tr>
     </w:tbl>
     <w:p/>
+    <w:p/>
+    <w:p/>
+    <w:p/>
     <w:p>
       <w:pPr>
         <w:pStyle w:val="Heading3"/>
       </w:pPr>
       <w:proofErr w:type="spellStart"/>
       <w:r>
+        <w:lastRenderedPageBreak/>
         <w:t>DiceSimulator</w:t>
       </w:r>
       <w:proofErr w:type="spellEnd"/>
@@ -2932,6 +3230,32 @@
         <w:tc>
           <w:tcPr>
             <w:tcW w:w="4673" w:type="dxa"/>
+          </w:tcPr>
+          <w:p>
+            <w:r>
+              <w:t xml:space="preserve">Does: </w:t>
+            </w:r>
+            <w:proofErr w:type="spellStart"/>
+            <w:r>
+              <w:rPr>
+                <w:color w:val="4C94D8" w:themeColor="text2" w:themeTint="80"/>
+              </w:rPr>
+              <w:t>displayHeader</w:t>
+            </w:r>
+            <w:proofErr w:type="spellEnd"/>
+          </w:p>
+        </w:tc>
+        <w:tc>
+          <w:tcPr>
+            <w:tcW w:w="4343" w:type="dxa"/>
+          </w:tcPr>
+          <w:p/>
+        </w:tc>
+      </w:tr>
+      <w:tr>
+        <w:tc>
+          <w:tcPr>
+            <w:tcW w:w="4673" w:type="dxa"/>
             <w:shd w:val="clear" w:color="auto" w:fill="FAE2D5" w:themeFill="accent2" w:themeFillTint="33"/>
           </w:tcPr>
           <w:p>
@@ -2943,15 +3267,7 @@
               </w:numPr>
             </w:pPr>
             <w:r>
-              <w:t xml:space="preserve">Action: Repeat </w:t>
-            </w:r>
-            <w:proofErr w:type="gramStart"/>
-            <w:r>
-              <w:t>20</w:t>
-            </w:r>
-            <w:proofErr w:type="gramEnd"/>
-            <w:r>
-              <w:t xml:space="preserve"> times</w:t>
+              <w:t>Action: Repeat 20 times</w:t>
             </w:r>
           </w:p>
         </w:tc>
@@ -3117,13 +3433,13 @@
         <w:tblLook w:val="04A0" w:firstRow="1" w:lastRow="0" w:firstColumn="1" w:lastColumn="0" w:noHBand="0" w:noVBand="1"/>
       </w:tblPr>
       <w:tblGrid>
-        <w:gridCol w:w="4673"/>
-        <w:gridCol w:w="4343"/>
+        <w:gridCol w:w="4674"/>
+        <w:gridCol w:w="4342"/>
       </w:tblGrid>
       <w:tr>
         <w:tc>
           <w:tcPr>
-            <w:tcW w:w="4673" w:type="dxa"/>
+            <w:tcW w:w="4674" w:type="dxa"/>
           </w:tcPr>
           <w:p>
             <w:pPr>
@@ -3136,7 +3452,7 @@
         </w:tc>
         <w:tc>
           <w:tcPr>
-            <w:tcW w:w="4343" w:type="dxa"/>
+            <w:tcW w:w="4342" w:type="dxa"/>
           </w:tcPr>
           <w:p>
             <w:pPr>
@@ -3151,7 +3467,7 @@
       <w:tr>
         <w:tc>
           <w:tcPr>
-            <w:tcW w:w="4673" w:type="dxa"/>
+            <w:tcW w:w="4674" w:type="dxa"/>
           </w:tcPr>
           <w:p>
             <w:r>
@@ -3167,7 +3483,7 @@
         </w:tc>
         <w:tc>
           <w:tcPr>
-            <w:tcW w:w="4343" w:type="dxa"/>
+            <w:tcW w:w="4342" w:type="dxa"/>
           </w:tcPr>
           <w:p>
             <w:r>
@@ -3182,7 +3498,7 @@
       <w:tr>
         <w:tc>
           <w:tcPr>
-            <w:tcW w:w="4673" w:type="dxa"/>
+            <w:tcW w:w="4674" w:type="dxa"/>
           </w:tcPr>
           <w:p>
             <w:r>
@@ -3210,7 +3526,7 @@
         </w:tc>
         <w:tc>
           <w:tcPr>
-            <w:tcW w:w="4343" w:type="dxa"/>
+            <w:tcW w:w="4342" w:type="dxa"/>
           </w:tcPr>
           <w:p>
             <w:proofErr w:type="spellStart"/>
@@ -3241,7 +3557,7 @@
       <w:tr>
         <w:tc>
           <w:tcPr>
-            <w:tcW w:w="4673" w:type="dxa"/>
+            <w:tcW w:w="4674" w:type="dxa"/>
           </w:tcPr>
           <w:p>
             <w:r>
@@ -3257,7 +3573,7 @@
         </w:tc>
         <w:tc>
           <w:tcPr>
-            <w:tcW w:w="4343" w:type="dxa"/>
+            <w:tcW w:w="4342" w:type="dxa"/>
           </w:tcPr>
           <w:p/>
         </w:tc>
@@ -3265,13 +3581,13 @@
       <w:tr>
         <w:tc>
           <w:tcPr>
-            <w:tcW w:w="4673" w:type="dxa"/>
+            <w:tcW w:w="4674" w:type="dxa"/>
           </w:tcPr>
           <w:p/>
         </w:tc>
         <w:tc>
           <w:tcPr>
-            <w:tcW w:w="4343" w:type="dxa"/>
+            <w:tcW w:w="4342" w:type="dxa"/>
           </w:tcPr>
           <w:p/>
         </w:tc>
@@ -3279,7 +3595,33 @@
       <w:tr>
         <w:tc>
           <w:tcPr>
-            <w:tcW w:w="4673" w:type="dxa"/>
+            <w:tcW w:w="4674" w:type="dxa"/>
+          </w:tcPr>
+          <w:p>
+            <w:r>
+              <w:t xml:space="preserve">Does: </w:t>
+            </w:r>
+            <w:proofErr w:type="spellStart"/>
+            <w:r>
+              <w:rPr>
+                <w:color w:val="4C94D8" w:themeColor="text2" w:themeTint="80"/>
+              </w:rPr>
+              <w:t>resetScore</w:t>
+            </w:r>
+            <w:proofErr w:type="spellEnd"/>
+          </w:p>
+        </w:tc>
+        <w:tc>
+          <w:tcPr>
+            <w:tcW w:w="4342" w:type="dxa"/>
+          </w:tcPr>
+          <w:p/>
+        </w:tc>
+      </w:tr>
+      <w:tr>
+        <w:tc>
+          <w:tcPr>
+            <w:tcW w:w="4674" w:type="dxa"/>
           </w:tcPr>
           <w:p>
             <w:pPr>
@@ -3360,7 +3702,7 @@
         </w:tc>
         <w:tc>
           <w:tcPr>
-            <w:tcW w:w="4343" w:type="dxa"/>
+            <w:tcW w:w="4342" w:type="dxa"/>
           </w:tcPr>
           <w:p/>
         </w:tc>
@@ -3368,60 +3710,7 @@
       <w:tr>
         <w:tc>
           <w:tcPr>
-            <w:tcW w:w="4673" w:type="dxa"/>
-          </w:tcPr>
-          <w:p>
-            <w:pPr>
-              <w:tabs>
-                <w:tab w:val="right" w:pos="4457"/>
-              </w:tabs>
-            </w:pPr>
-            <w:r>
-              <w:t xml:space="preserve">Does: </w:t>
-            </w:r>
-            <w:proofErr w:type="spellStart"/>
-            <w:r>
-              <w:rPr>
-                <w:color w:val="4C94D8" w:themeColor="text2" w:themeTint="80"/>
-              </w:rPr>
-              <w:t>resetScore</w:t>
-            </w:r>
-            <w:proofErr w:type="spellEnd"/>
-            <w:r>
-              <w:rPr>
-                <w:color w:val="196B24" w:themeColor="accent3"/>
-              </w:rPr>
-              <w:tab/>
-            </w:r>
-          </w:p>
-        </w:tc>
-        <w:tc>
-          <w:tcPr>
-            <w:tcW w:w="4343" w:type="dxa"/>
-          </w:tcPr>
-          <w:p/>
-        </w:tc>
-      </w:tr>
-      <w:tr>
-        <w:tc>
-          <w:tcPr>
-            <w:tcW w:w="4673" w:type="dxa"/>
-            <w:shd w:val="clear" w:color="auto" w:fill="FAE2D5" w:themeFill="accent2" w:themeFillTint="33"/>
-          </w:tcPr>
-          <w:p/>
-        </w:tc>
-        <w:tc>
-          <w:tcPr>
-            <w:tcW w:w="4343" w:type="dxa"/>
-          </w:tcPr>
-          <w:p/>
-        </w:tc>
-      </w:tr>
-      <w:tr>
-        <w:tc>
-          <w:tcPr>
-            <w:tcW w:w="4673" w:type="dxa"/>
-            <w:shd w:val="clear" w:color="auto" w:fill="FAE2D5" w:themeFill="accent2" w:themeFillTint="33"/>
+            <w:tcW w:w="4674" w:type="dxa"/>
           </w:tcPr>
           <w:p>
             <w:pPr>
@@ -3452,10 +3741,7 @@
               </w:numPr>
             </w:pPr>
             <w:r>
-              <w:t xml:space="preserve">Action: </w:t>
-            </w:r>
-            <w:r>
-              <w:t xml:space="preserve">While </w:t>
+              <w:t xml:space="preserve">Action: While </w:t>
             </w:r>
             <w:r>
               <w:rPr>
@@ -3464,15 +3750,7 @@
               <w:t xml:space="preserve">score </w:t>
             </w:r>
             <w:r>
-              <w:t xml:space="preserve">not </w:t>
-            </w:r>
-            <w:proofErr w:type="gramStart"/>
-            <w:r>
-              <w:t>0</w:t>
-            </w:r>
-            <w:proofErr w:type="gramEnd"/>
-            <w:r>
-              <w:t xml:space="preserve"> and </w:t>
+              <w:t xml:space="preserve">not 0 and </w:t>
             </w:r>
             <w:r>
               <w:rPr>
@@ -3481,13 +3759,8 @@
               <w:t xml:space="preserve">roll </w:t>
             </w:r>
             <w:r>
-              <w:t xml:space="preserve">not </w:t>
-            </w:r>
-            <w:proofErr w:type="gramStart"/>
-            <w:r>
-              <w:t>6</w:t>
-            </w:r>
-            <w:proofErr w:type="gramEnd"/>
+              <w:t>not 6</w:t>
+            </w:r>
           </w:p>
           <w:p>
             <w:pPr>
@@ -3504,13 +3777,8 @@
               <w:t xml:space="preserve">score </w:t>
             </w:r>
             <w:r>
-              <w:t xml:space="preserve">– </w:t>
-            </w:r>
-            <w:proofErr w:type="gramStart"/>
-            <w:r>
-              <w:t>1</w:t>
-            </w:r>
-            <w:proofErr w:type="gramEnd"/>
+              <w:t>– 1</w:t>
+            </w:r>
           </w:p>
           <w:p>
             <w:pPr>
@@ -3561,7 +3829,7 @@
         </w:tc>
         <w:tc>
           <w:tcPr>
-            <w:tcW w:w="4343" w:type="dxa"/>
+            <w:tcW w:w="4342" w:type="dxa"/>
           </w:tcPr>
           <w:p>
             <w:pPr>
@@ -3573,14 +3841,11 @@
       <w:tr>
         <w:tc>
           <w:tcPr>
-            <w:tcW w:w="4673" w:type="dxa"/>
-          </w:tcPr>
-          <w:p>
-            <w:r>
-              <w:t xml:space="preserve">Does: </w:t>
-            </w:r>
-            <w:r>
-              <w:t xml:space="preserve">Displays </w:t>
+            <w:tcW w:w="4674" w:type="dxa"/>
+          </w:tcPr>
+          <w:p>
+            <w:r>
+              <w:t xml:space="preserve">Does: Displays </w:t>
             </w:r>
             <w:proofErr w:type="spellStart"/>
             <w:r>
@@ -3598,28 +3863,40 @@
             </w:r>
             <w:proofErr w:type="gramStart"/>
             <w:r>
-              <w:t>using</w:t>
-            </w:r>
-            <w:r>
+              <w:t xml:space="preserve">using  </w:t>
+            </w:r>
+            <w:proofErr w:type="spellStart"/>
+            <w:r>
+              <w:rPr>
+                <w:color w:val="196B24" w:themeColor="accent3"/>
+              </w:rPr>
+              <w:t>userName</w:t>
+            </w:r>
+            <w:proofErr w:type="spellEnd"/>
+            <w:proofErr w:type="gramEnd"/>
+            <w:r>
+              <w:rPr>
+                <w:color w:val="196B24" w:themeColor="accent3"/>
+              </w:rPr>
               <w:t xml:space="preserve"> </w:t>
             </w:r>
             <w:r>
-              <w:t xml:space="preserve"> </w:t>
-            </w:r>
-            <w:proofErr w:type="spellStart"/>
+              <w:rPr>
+                <w:color w:val="000000" w:themeColor="text1"/>
+              </w:rPr>
+              <w:t xml:space="preserve">and </w:t>
+            </w:r>
             <w:r>
               <w:rPr>
                 <w:color w:val="196B24" w:themeColor="accent3"/>
               </w:rPr>
-              <w:t>userName</w:t>
-            </w:r>
-            <w:proofErr w:type="spellEnd"/>
-            <w:proofErr w:type="gramEnd"/>
-          </w:p>
-        </w:tc>
-        <w:tc>
-          <w:tcPr>
-            <w:tcW w:w="4343" w:type="dxa"/>
+              <w:t>score</w:t>
+            </w:r>
+          </w:p>
+        </w:tc>
+        <w:tc>
+          <w:tcPr>
+            <w:tcW w:w="4342" w:type="dxa"/>
           </w:tcPr>
           <w:p/>
         </w:tc>
@@ -3627,8 +3904,7 @@
     </w:tbl>
     <w:p>
       <w:r>
-        <w:lastRenderedPageBreak/>
-        <w:t xml:space="preserve">Added </w:t>
+        <w:t xml:space="preserve"> </w:t>
       </w:r>
     </w:p>
     <w:p/>

</xml_diff>